<commit_message>
feat: adicionar validacao de e-mail e cpf/cnpj com mensagens inline
</commit_message>
<xml_diff>
--- a/Contrato/CONTRATO_COSMO_ALMA_TV_V2.docx
+++ b/Contrato/CONTRATO_COSMO_ALMA_TV_V2.docx
@@ -236,7 +236,7 @@
               <w:rPr>
                 <w:rtl w:val="0"/>
               </w:rPr>
-              <w:t xml:space="preserve">, inscrito no CPF sob o nº xxx.xxx.xxx-xx; e 3) </w:t>
+              <w:t xml:space="preserve">, inscrito no CPF sob o nº 005.635.977-20; e 3) </w:t>
             </w:r>
             <w:r>
               <w:rPr>
@@ -244,13 +244,13 @@
                 <w:bCs w:val="1"/>
                 <w:rtl w:val="0"/>
               </w:rPr>
-              <w:t xml:space="preserve">MARCOS CARAM</w:t>
-            </w:r>
-            <w:r>
-              <w:rPr>
-                <w:rtl w:val="0"/>
-              </w:rPr>
-              <w:t xml:space="preserve">, inscrito no CPF sob o nº xxx.xxx.xxx-xx; com correio eletrônico institucional registrado sob o e-mail: cosmoalmatv@gmail.com, e sede provisória estabelecida na Rua Álvaro Alvim, nº 24, sala 1004, Cinelândia, Rio de Janeiro, RJ.</w:t>
+              <w:t xml:space="preserve">MARCOS DE REZENDE CARAM</w:t>
+            </w:r>
+            <w:r>
+              <w:rPr>
+                <w:rtl w:val="0"/>
+              </w:rPr>
+              <w:t xml:space="preserve">, inscrito no CPF sob o nº 003.617.617-67; com correio eletrônico institucional registrado sob o e-mail: cosmoalmatv@gmail.com, e sede provisória estabelecida na Rua Álvaro Alvim, nº 24, sala 1004, Cinelândia, Rio de Janeiro, RJ.</w:t>
             </w:r>
           </w:p>
           <w:p>
@@ -265,13 +265,13 @@
                 <w:bCs w:val="1"/>
                 <w:rtl w:val="0"/>
               </w:rPr>
-              <w:t xml:space="preserve">O CONDÔMINO: PARADOXO CASA ATELIÊ</w:t>
-            </w:r>
-            <w:r>
-              <w:rPr>
-                <w:rtl w:val="0"/>
-              </w:rPr>
-              <w:t xml:space="preserve">, pessoa jurídica inscrita no CNPJ sob o nº 49.759.501/0001-45, representada neste ato por sua titular e responsável legal, </w:t>
+              <w:t xml:space="preserve">O CONDÔMINO: [nome PESSOA FISICA OU JURÍDICA]</w:t>
+            </w:r>
+            <w:r>
+              <w:rPr>
+                <w:rtl w:val="0"/>
+              </w:rPr>
+              <w:t xml:space="preserve">, pessoa [física/jurídica] inscrita no [CPF/CNPJ] sob o nº [número cpf OU cnpj], representada neste ato por sua titular e responsável legal, </w:t>
             </w:r>
             <w:r>
               <w:rPr>
@@ -279,13 +279,13 @@
                 <w:bCs w:val="1"/>
                 <w:rtl w:val="0"/>
               </w:rPr>
-              <w:t xml:space="preserve">MANY XAVIER DE BRITO E SOUZA BERNABÉ</w:t>
-            </w:r>
-            <w:r>
-              <w:rPr>
-                <w:rtl w:val="0"/>
-              </w:rPr>
-              <w:t xml:space="preserve">, brasileira, casada, microempresária, inscrita no CPF sob o nº 789.620.807-53, com sede comercial localizada na Avenida Edson Passos, nº 87, sobrado, Usina, Rio de Janeiro, RJ.</w:t>
+              <w:t xml:space="preserve">[NOME]</w:t>
+            </w:r>
+            <w:r>
+              <w:rPr>
+                <w:rtl w:val="0"/>
+              </w:rPr>
+              <w:t xml:space="preserve">, brasileira, [ESTADO civil], inscrita no CPF sob o nº [CPF], com sede comercial localizada na [ENDEREÇO].</w:t>
             </w:r>
           </w:p>
         </w:tc>
@@ -1243,22 +1243,44 @@
             <w:pPr>
               <w:spacing w:after="20" w:lineRule="auto"/>
               <w:jc w:val="center"/>
-              <w:rPr/>
-            </w:pPr>
-            <w:r>
               <w:rPr>
                 <w:b w:val="1"/>
                 <w:bCs w:val="1"/>
                 <w:sz w:val="20"/>
                 <w:szCs w:val="20"/>
+              </w:rPr>
+            </w:pPr>
+            <w:r>
+              <w:rPr>
+                <w:b w:val="1"/>
+                <w:bCs w:val="1"/>
+                <w:sz w:val="20"/>
+                <w:szCs w:val="20"/>
                 <w:rtl w:val="0"/>
               </w:rPr>
               <w:t xml:space="preserve">COSMO ALMA TV</w:t>
             </w:r>
-            <w:r>
-              <w:rPr>
-                <w:rtl w:val="0"/>
-              </w:rPr>
+          </w:p>
+          <w:p>
+            <w:pPr>
+              <w:spacing w:after="20" w:lineRule="auto"/>
+              <w:jc w:val="center"/>
+              <w:rPr>
+                <w:b w:val="1"/>
+                <w:bCs w:val="1"/>
+                <w:sz w:val="20"/>
+                <w:szCs w:val="20"/>
+              </w:rPr>
+            </w:pPr>
+            <w:r>
+              <w:rPr>
+                <w:b w:val="1"/>
+                <w:bCs w:val="1"/>
+                <w:sz w:val="20"/>
+                <w:szCs w:val="20"/>
+                <w:rtl w:val="0"/>
+              </w:rPr>
+              <w:t xml:space="preserve">Alexandre Parreira Bernabé</w:t>
             </w:r>
           </w:p>
           <w:p>
@@ -1320,7 +1342,7 @@
                 <w:szCs w:val="20"/>
                 <w:rtl w:val="0"/>
               </w:rPr>
-              <w:t xml:space="preserve">PARADOXO CASA ATELIÊ</w:t>
+              <w:t xml:space="preserve">[NOME]</w:t>
             </w:r>
             <w:r>
               <w:rPr>
@@ -1343,7 +1365,7 @@
                 <w:szCs w:val="18"/>
                 <w:rtl w:val="0"/>
               </w:rPr>
-              <w:t xml:space="preserve">CONDÔMINO — Many Xavier de B. e S. Bernabé</w:t>
+              <w:t xml:space="preserve">CONDÔMINO </w:t>
             </w:r>
             <w:r>
               <w:rPr>
@@ -1951,7 +1973,7 @@
 
 <file path=customXML/item1.xml><?xml version="1.0" encoding="utf-8"?>
 <go:gDocsCustomXmlDataStorage xmlns:go="http://customooxmlschemas.google.com/" xmlns:r="http://schemas.openxmlformats.org/officeDocument/2006/relationships" uri="GoogleDocsCustomDataVersion2">
-  <go:docsCustomData xmlns:go="http://customooxmlschemas.google.com/" roundtripDataSignature="AMtx7mhIfe4SQz1HCDckqBlW0CYYHt0dxw==">CgMxLjA4AHIhMWxIT2I3alktUmpqcDhmMldYb0RTc2JuU213RFU4YnVm</go:docsCustomData>
+  <go:docsCustomData xmlns:go="http://customooxmlschemas.google.com/" roundtripDataSignature="AMtx7mg2opiEPePhlDP96oudaPorhgKz6A==">CgMxLjA4AHIhMXg0eHI0YXB0bjJpZTlfekgxUlVGWGxBVGJ4YUUzbmct</go:docsCustomData>
 </go:gDocsCustomXmlDataStorage>
 </file>
 

</xml_diff>